<commit_message>
feat(simulador): opciones de la herramienta a la izquierda del lienzo, columnas que se arrastran, barra lateral plegable y más margen contra la pantalla en blanco (D-205)
Co-Authored-By: Claude Sonnet 5.5 <noreply@anthropic.com>
</commit_message>
<xml_diff>
--- a/docs/MANUAL-DEL-EDITOR.docx
+++ b/docs/MANUAL-DEL-EDITOR.docx
@@ -3734,6 +3734,21 @@
         <w:spacing w:after="120" w:line="288"/>
       </w:pPr>
       <w:r>
+        <w:rPr>
+          <w:b/>
+          <w:bCs/>
+        </w:rPr>
+        <w:t xml:space="preserve">La barra lateral se pliega:</w:t>
+      </w:r>
+      <w:r>
+        <w:t xml:space="preserve"> un botón bajo el logotipo la deja en una columna angosta con solo el libro del logotipo y un icono por pestaña (el nombre sale al pasar el ratón), para dar más ancho a la pantalla de trabajo. Se recuerda en el navegador.</w:t>
+      </w:r>
+    </w:p>
+    <w:p>
+      <w:pPr>
+        <w:spacing w:after="120" w:line="288"/>
+      </w:pPr>
+      <w:r>
         <w:t xml:space="preserve">Los grupos </w:t>
       </w:r>
       <w:r>
@@ -6994,6 +7009,39 @@
       </w:r>
       <w:r>
         <w:t xml:space="preserve"> con orificio oval.</w:t>
+      </w:r>
+    </w:p>
+    <w:p>
+      <w:pPr>
+        <w:pStyle w:val="ListParagraph"/>
+        <w:numPr>
+          <w:ilvl w:val="0"/>
+          <w:numId w:val="4"/>
+        </w:numPr>
+        <w:spacing w:after="90" w:line="280"/>
+      </w:pPr>
+      <w:r>
+        <w:t xml:space="preserve">Las </w:t>
+      </w:r>
+      <w:r>
+        <w:rPr>
+          <w:b/>
+          <w:bCs/>
+        </w:rPr>
+        <w:t xml:space="preserve">opciones de la herramienta en la mano</w:t>
+      </w:r>
+      <w:r>
+        <w:t xml:space="preserve"> se despliegan a la izquierda del lienzo, y las columnas de los lados se </w:t>
+      </w:r>
+      <w:r>
+        <w:rPr>
+          <w:b/>
+          <w:bCs/>
+        </w:rPr>
+        <w:t xml:space="preserve">ensanchan o angostan arrastrando</w:t>
+      </w:r>
+      <w:r>
+        <w:t xml:space="preserve"> su borde. Si la imagen se detiene, la consola la recupera sola.</w:t>
       </w:r>
     </w:p>
     <w:p>

</xml_diff>

<commit_message>
feat(simulador): el aviso de la herramienta sale a la derecha de su recuadro y suben los límites contra el blanco: modelos de 20 MB y 16 millones de píxeles (D-206)
Co-Authored-By: Claude Sonnet 5.5 <noreply@anthropic.com>
</commit_message>
<xml_diff>
--- a/docs/MANUAL-DEL-EDITOR.docx
+++ b/docs/MANUAL-DEL-EDITOR.docx
@@ -5425,7 +5425,7 @@
               <w:spacing w:after="30" w:line="264"/>
             </w:pPr>
             <w:r>
-              <w:t xml:space="preserve">5 MB</w:t>
+              <w:t xml:space="preserve">20 MB</w:t>
             </w:r>
           </w:p>
         </w:tc>
@@ -8082,7 +8082,7 @@
               <w:spacing w:after="30" w:line="264"/>
             </w:pPr>
             <w:r>
-              <w:t xml:space="preserve">Formato o peso: 50 MB imagen y video, 5 MB modelos, video solo MP4 o WEBM.</w:t>
+              <w:t xml:space="preserve">Formato o peso: 50 MB imagen y video, 20 MB modelos, video solo MP4 o WEBM.</w:t>
             </w:r>
           </w:p>
         </w:tc>

</xml_diff>

<commit_message>
feat(simulador): las placas se doblan y se tuercen fuera del hueso, en una mesa de modelado, con el alicate y la grifa (D-207, P-005 E1)
Co-Authored-By: Claude Sonnet 5.5 <noreply@anthropic.com>
</commit_message>
<xml_diff>
--- a/docs/MANUAL-DEL-EDITOR.docx
+++ b/docs/MANUAL-DEL-EDITOR.docx
@@ -7042,6 +7042,29 @@
       </w:r>
       <w:r>
         <w:t xml:space="preserve"> su borde. Si la imagen se detiene, la consola la recupera sola.</w:t>
+      </w:r>
+    </w:p>
+    <w:p>
+      <w:pPr>
+        <w:pStyle w:val="ListParagraph"/>
+        <w:numPr>
+          <w:ilvl w:val="0"/>
+          <w:numId w:val="4"/>
+        </w:numPr>
+        <w:spacing w:after="90" w:line="280"/>
+      </w:pPr>
+      <w:r>
+        <w:t xml:space="preserve">Las </w:t>
+      </w:r>
+      <w:r>
+        <w:rPr>
+          <w:b/>
+          <w:bCs/>
+        </w:rPr>
+        <w:t xml:space="preserve">placas se doblan y se tuercen fuera del hueso</w:t>
+      </w:r>
+      <w:r>
+        <w:t xml:space="preserve">, sobre una mesa de modelado dentro del lienzo, con el alicate de doblado y la grifa; después se llevan al hueso con la forma que se les dio.</w:t>
       </w:r>
     </w:p>
     <w:p>

</xml_diff>